<commit_message>
Add leader-only topic deletion with cancellation notices, extend color/contrast fixes site-wide
</commit_message>
<xml_diff>
--- a/Community_Gatherings_App_Summary.docx
+++ b/Community_Gatherings_App_Summary.docx
@@ -741,6 +741,136 @@
           </w:p>
         </w:tc>
       </w:tr>
+      <w:tr>
+        <w:tc>
+          <w:tcPr>
+            <w:tcW w:type="dxa" w:w="2600"/>
+            <w:shd w:fill="F7F0E8" w:color="auto" w:val="clear"/>
+            <w:tcMar>
+              <w:top w:type="dxa" w:w="100"/>
+              <w:left w:type="dxa" w:w="120"/>
+              <w:bottom w:type="dxa" w:w="100"/>
+              <w:right w:type="dxa" w:w="120"/>
+            </w:tcMar>
+          </w:tcPr>
+          <w:p>
+            <w:r>
+              <w:rPr>
+                <w:b w:val="false"/>
+                <w:bCs w:val="false"/>
+              </w:rPr>
+              <w:t xml:space="preserve">12. Site-wide visual consistency</w:t>
+            </w:r>
+          </w:p>
+        </w:tc>
+        <w:tc>
+          <w:tcPr>
+            <w:tcW w:type="dxa" w:w="6760"/>
+            <w:shd w:fill="F7F0E8" w:color="auto" w:val="clear"/>
+            <w:tcMar>
+              <w:top w:type="dxa" w:w="100"/>
+              <w:left w:type="dxa" w:w="120"/>
+              <w:bottom w:type="dxa" w:w="100"/>
+              <w:right w:type="dxa" w:w="120"/>
+            </w:tcMar>
+          </w:tcPr>
+          <w:p>
+            <w:r>
+              <w:rPr>
+                <w:b w:val="false"/>
+                <w:bCs w:val="false"/>
+              </w:rPr>
+              <w:t xml:space="preserve">Extended the warm orange-and-black restyle and the accessibility color fixes from the group pages to every page of the app, so the look and readability are consistent throughout.</w:t>
+            </w:r>
+          </w:p>
+        </w:tc>
+      </w:tr>
+      <w:tr>
+        <w:tc>
+          <w:tcPr>
+            <w:tcW w:type="dxa" w:w="2600"/>
+            <w:tcMar>
+              <w:top w:type="dxa" w:w="100"/>
+              <w:left w:type="dxa" w:w="120"/>
+              <w:bottom w:type="dxa" w:w="100"/>
+              <w:right w:type="dxa" w:w="120"/>
+            </w:tcMar>
+          </w:tcPr>
+          <w:p>
+            <w:r>
+              <w:rPr>
+                <w:b w:val="false"/>
+                <w:bCs w:val="false"/>
+              </w:rPr>
+              <w:t xml:space="preserve">13. Cross-browser testing</w:t>
+            </w:r>
+          </w:p>
+        </w:tc>
+        <w:tc>
+          <w:tcPr>
+            <w:tcW w:type="dxa" w:w="6760"/>
+            <w:tcMar>
+              <w:top w:type="dxa" w:w="100"/>
+              <w:left w:type="dxa" w:w="120"/>
+              <w:bottom w:type="dxa" w:w="100"/>
+              <w:right w:type="dxa" w:w="120"/>
+            </w:tcMar>
+          </w:tcPr>
+          <w:p>
+            <w:r>
+              <w:rPr>
+                <w:b w:val="false"/>
+                <w:bCs w:val="false"/>
+              </w:rPr>
+              <w:t xml:space="preserve">Added Firefox alongside Chrome in the automated Playwright test suite, both locally and in the GitHub Actions pipeline, so every change is verified in two browser engines before it's considered done.</w:t>
+            </w:r>
+          </w:p>
+        </w:tc>
+      </w:tr>
+      <w:tr>
+        <w:tc>
+          <w:tcPr>
+            <w:tcW w:type="dxa" w:w="2600"/>
+            <w:shd w:fill="F7F0E8" w:color="auto" w:val="clear"/>
+            <w:tcMar>
+              <w:top w:type="dxa" w:w="100"/>
+              <w:left w:type="dxa" w:w="120"/>
+              <w:bottom w:type="dxa" w:w="100"/>
+              <w:right w:type="dxa" w:w="120"/>
+            </w:tcMar>
+          </w:tcPr>
+          <w:p>
+            <w:r>
+              <w:rPr>
+                <w:b w:val="false"/>
+                <w:bCs w:val="false"/>
+              </w:rPr>
+              <w:t xml:space="preserve">14. Topic deletion &amp; cancellation notices</w:t>
+            </w:r>
+          </w:p>
+        </w:tc>
+        <w:tc>
+          <w:tcPr>
+            <w:tcW w:type="dxa" w:w="6760"/>
+            <w:shd w:fill="F7F0E8" w:color="auto" w:val="clear"/>
+            <w:tcMar>
+              <w:top w:type="dxa" w:w="100"/>
+              <w:left w:type="dxa" w:w="120"/>
+              <w:bottom w:type="dxa" w:w="100"/>
+              <w:right w:type="dxa" w:w="120"/>
+            </w:tcMar>
+          </w:tcPr>
+          <w:p>
+            <w:r>
+              <w:rPr>
+                <w:b w:val="false"/>
+                <w:bCs w:val="false"/>
+              </w:rPr>
+              <w:t xml:space="preserve">Gave group leaders the ability to remove a topic entirely — whether it's still just a suggestion, or one that's already been selected with a scheduled date. Deleting a selected topic automatically sends every member a cancellation notice so no one is left expecting a gathering that isn't happening.</w:t>
+            </w:r>
+          </w:p>
+        </w:tc>
+      </w:tr>
     </w:tbl>
     <w:p>
       <w:pPr>
@@ -1360,7 +1490,7 @@
         <w:spacing w:after="160"/>
       </w:pPr>
       <w:r>
-        <w:t xml:space="preserve">The prototype is fully functional and covers the entire flow described above: sign-up, group membership with leader approval, topic suggestion, group-wide voting (a member can now back more than one topic at a time) with a leader-controlled deadline, topic selection with notifications, and both the email-link and password-based login methods with account recovery. Selected topics automatically drop out of the active list once their gathering date has passed, and a round of accessibility fixes cleaned up text and buttons that were hard to read. Every feature has been verified both manually and through the automated Playwright test suite, and the project is version-controlled on GitHub with a working CI/CD pipeline.</w:t>
+        <w:t xml:space="preserve">The prototype is fully functional and covers the entire flow described above: sign-up, group membership with leader approval, topic suggestion, group-wide voting (a member can now back more than one topic at a time) with a leader-controlled deadline, topic selection with notifications, and both the email-link and password-based login methods with account recovery. Selected topics automatically drop out of the active list once their gathering date has passed, and a round of accessibility fixes — now applied across the entire site, not just the group pages — cleaned up text and buttons that were hard to read, alongside a consistent warm orange visual style. A group leader can also remove a topic outright, with members automatically notified if a topic being removed had already been selected and scheduled. Every feature has been verified both manually and through the automated Playwright test suite (now run against both Chrome and Firefox), and the project is version-controlled on GitHub with a working CI/CD pipeline.</w:t>
       </w:r>
     </w:p>
     <w:p>

</xml_diff>